<commit_message>
Rewrite Palo Alto email - generic architectural ask, remove sample-specific details
</commit_message>
<xml_diff>
--- a/emails/email_palo_alto.docx
+++ b/emails/email_palo_alto.docx
@@ -68,7 +68,7 @@
           <w:sz w:val="22"/>
           <w:szCs w:val="22"/>
         </w:rPr>
-        <w:t xml:space="preserve">  XSIAM Parsing Query - Windows Event Ingestion via Cribl Stream (Custom HTTP Endpoint)</w:t>
+        <w:t xml:space="preserve">  XSIAM Ingestion Query - Introducing Cribl Stream Between WEC and XSIAM</w:t>
       </w:r>
     </w:p>
     <w:p>
@@ -120,7 +120,7 @@
           <w:sz w:val="22"/>
           <w:szCs w:val="22"/>
         </w:rPr>
-        <w:t xml:space="preserve">We are currently migrating our Windows Event Collection (WEC) infrastructure from the Azure Monitoring Agent (AMA) to Cribl Edge + Cribl Stream. Cribl Stream is forwarding Windows events to XSIAM via a custom HTTP endpoint into our microsoft_windows_raw dataset. We are running into a field population issue and wanted to get your guidance before we go further.</w:t>
+        <w:t xml:space="preserve">We are currently migrating our Windows Event Collection (WEC) infrastructure and wanted to get your guidance on how this change may affect our existing XSIAM ingestion pipeline before we proceed further.</w:t>
       </w:r>
     </w:p>
     <w:p>
@@ -152,7 +152,229 @@
           <w:sz w:val="24"/>
           <w:szCs w:val="24"/>
         </w:rPr>
-        <w:t xml:space="preserve">What We Are Seeing</w:t>
+        <w:t xml:space="preserve">Current Setup</w:t>
+      </w:r>
+    </w:p>
+    <w:p>
+      <w:pPr>
+        <w:spacing w:after="100"/>
+      </w:pPr>
+      <w:r>
+        <w:rPr>
+          <w:rFonts w:ascii="Arial" w:cs="Arial" w:eastAsia="Arial" w:hAnsi="Arial"/>
+          <w:sz w:val="22"/>
+          <w:szCs w:val="22"/>
+        </w:rPr>
+        <w:t xml:space="preserve">Our current ingestion flow is:</w:t>
+      </w:r>
+    </w:p>
+    <w:p>
+      <w:pPr>
+        <w:spacing w:after="80"/>
+      </w:pPr>
+      <w:r>
+        <w:rPr>
+          <w:rFonts w:ascii="Arial" w:cs="Arial" w:eastAsia="Arial" w:hAnsi="Arial"/>
+          <w:sz w:val="22"/>
+          <w:szCs w:val="22"/>
+        </w:rPr>
+        <w:t xml:space="preserve"/>
+      </w:r>
+    </w:p>
+    <w:p>
+      <w:pPr>
+        <w:spacing w:after="100"/>
+      </w:pPr>
+      <w:r>
+        <w:rPr>
+          <w:rFonts w:ascii="Arial" w:cs="Arial" w:eastAsia="Arial" w:hAnsi="Arial"/>
+          <w:sz w:val="22"/>
+          <w:szCs w:val="22"/>
+        </w:rPr>
+        <w:t xml:space="preserve">Windows Endpoints  -&gt;  WEC Servers  -&gt;  WEC Brokers  -&gt;  XSIAM</w:t>
+      </w:r>
+      <indent/>
+    </w:p>
+    <w:p>
+      <w:pPr>
+        <w:spacing w:after="80"/>
+      </w:pPr>
+      <w:r>
+        <w:rPr>
+          <w:rFonts w:ascii="Arial" w:cs="Arial" w:eastAsia="Arial" w:hAnsi="Arial"/>
+          <w:sz w:val="22"/>
+          <w:szCs w:val="22"/>
+        </w:rPr>
+        <w:t xml:space="preserve"/>
+      </w:r>
+    </w:p>
+    <w:p>
+      <w:pPr>
+        <w:spacing w:after="100"/>
+      </w:pPr>
+      <w:r>
+        <w:rPr>
+          <w:rFonts w:ascii="Arial" w:cs="Arial" w:eastAsia="Arial" w:hAnsi="Arial"/>
+          <w:sz w:val="22"/>
+          <w:szCs w:val="22"/>
+        </w:rPr>
+        <w:t xml:space="preserve">Under this setup, Windows events are forwarded from endpoints to WEC servers, collected by WEC brokers, and ingested directly into XSIAM. The current pipeline is working correctly - all fields are populated and XSIAM's normalisation is functioning as expected.</w:t>
+      </w:r>
+    </w:p>
+    <w:p>
+      <w:pPr>
+        <w:spacing w:after="80"/>
+      </w:pPr>
+      <w:r>
+        <w:rPr>
+          <w:rFonts w:ascii="Arial" w:cs="Arial" w:eastAsia="Arial" w:hAnsi="Arial"/>
+          <w:sz w:val="22"/>
+          <w:szCs w:val="22"/>
+        </w:rPr>
+        <w:t xml:space="preserve"/>
+      </w:r>
+    </w:p>
+    <w:p>
+      <w:pPr>
+        <w:pBdr>
+          <w:bottom w:val="single" w:color="1F4E79" w:sz="4"/>
+        </w:pBdr>
+        <w:spacing w:after="120" w:before="240"/>
+      </w:pPr>
+      <w:r>
+        <w:rPr>
+          <w:rFonts w:ascii="Arial" w:cs="Arial" w:eastAsia="Arial" w:hAnsi="Arial"/>
+          <w:b/>
+          <w:bCs/>
+          <w:color w:val="1F4E79"/>
+          <w:sz w:val="24"/>
+          <w:szCs w:val="24"/>
+        </w:rPr>
+        <w:t xml:space="preserve">What We Are Changing</w:t>
+      </w:r>
+    </w:p>
+    <w:p>
+      <w:pPr>
+        <w:spacing w:after="100"/>
+      </w:pPr>
+      <w:r>
+        <w:rPr>
+          <w:rFonts w:ascii="Arial" w:cs="Arial" w:eastAsia="Arial" w:hAnsi="Arial"/>
+          <w:sz w:val="22"/>
+          <w:szCs w:val="22"/>
+        </w:rPr>
+        <w:t xml:space="preserve">We are introducing Cribl Edge and Cribl Stream into the pipeline between the WEC brokers and XSIAM:</w:t>
+      </w:r>
+    </w:p>
+    <w:p>
+      <w:pPr>
+        <w:spacing w:after="80"/>
+      </w:pPr>
+      <w:r>
+        <w:rPr>
+          <w:rFonts w:ascii="Arial" w:cs="Arial" w:eastAsia="Arial" w:hAnsi="Arial"/>
+          <w:sz w:val="22"/>
+          <w:szCs w:val="22"/>
+        </w:rPr>
+        <w:t xml:space="preserve"/>
+      </w:r>
+    </w:p>
+    <w:p>
+      <w:pPr>
+        <w:spacing w:after="100"/>
+      </w:pPr>
+      <w:r>
+        <w:rPr>
+          <w:rFonts w:ascii="Arial" w:cs="Arial" w:eastAsia="Arial" w:hAnsi="Arial"/>
+          <w:sz w:val="22"/>
+          <w:szCs w:val="22"/>
+        </w:rPr>
+        <w:t xml:space="preserve">Windows Endpoints  -&gt;  WEC Servers  -&gt;  Cribl Edge  -&gt;  Cribl Stream  -&gt;  XSIAM</w:t>
+      </w:r>
+      <indent/>
+    </w:p>
+    <w:p>
+      <w:pPr>
+        <w:spacing w:after="80"/>
+      </w:pPr>
+      <w:r>
+        <w:rPr>
+          <w:rFonts w:ascii="Arial" w:cs="Arial" w:eastAsia="Arial" w:hAnsi="Arial"/>
+          <w:sz w:val="22"/>
+          <w:szCs w:val="22"/>
+        </w:rPr>
+        <w:t xml:space="preserve"/>
+      </w:r>
+    </w:p>
+    <w:p>
+      <w:pPr>
+        <w:spacing w:after="100"/>
+      </w:pPr>
+      <w:r>
+        <w:rPr>
+          <w:rFonts w:ascii="Arial" w:cs="Arial" w:eastAsia="Arial" w:hAnsi="Arial"/>
+          <w:sz w:val="22"/>
+          <w:szCs w:val="22"/>
+        </w:rPr>
+        <w:t xml:space="preserve">Cribl Edge is installed on the WEC servers and replaces the direct broker forwarding. Cribl Stream then routes the events to XSIAM via the custom HTTP endpoint into our microsoft_windows_raw dataset.</w:t>
+      </w:r>
+    </w:p>
+    <w:p>
+      <w:pPr>
+        <w:spacing w:after="80"/>
+      </w:pPr>
+      <w:r>
+        <w:rPr>
+          <w:rFonts w:ascii="Arial" w:cs="Arial" w:eastAsia="Arial" w:hAnsi="Arial"/>
+          <w:sz w:val="22"/>
+          <w:szCs w:val="22"/>
+        </w:rPr>
+        <w:t xml:space="preserve"/>
+      </w:r>
+    </w:p>
+    <w:p>
+      <w:pPr>
+        <w:pBdr>
+          <w:bottom w:val="single" w:color="1F4E79" w:sz="4"/>
+        </w:pBdr>
+        <w:spacing w:after="120" w:before="240"/>
+      </w:pPr>
+      <w:r>
+        <w:rPr>
+          <w:rFonts w:ascii="Arial" w:cs="Arial" w:eastAsia="Arial" w:hAnsi="Arial"/>
+          <w:b/>
+          <w:bCs/>
+          <w:color w:val="1F4E79"/>
+          <w:sz w:val="24"/>
+          <w:szCs w:val="24"/>
+        </w:rPr>
+        <w:t xml:space="preserve">Our Question</w:t>
+      </w:r>
+    </w:p>
+    <w:p>
+      <w:pPr>
+        <w:spacing w:after="100"/>
+      </w:pPr>
+      <w:r>
+        <w:rPr>
+          <w:rFonts w:ascii="Arial" w:cs="Arial" w:eastAsia="Arial" w:hAnsi="Arial"/>
+          <w:sz w:val="22"/>
+          <w:szCs w:val="22"/>
+        </w:rPr>
+        <w:t xml:space="preserve">Our goal is for this change to be completely transparent from XSIAM's perspective. We want the same dataset, the same field population, and the same normalisation behaviour that we have today under the direct WEC broker ingestion.</w:t>
+      </w:r>
+    </w:p>
+    <w:p>
+      <w:pPr>
+        <w:spacing w:after="80"/>
+      </w:pPr>
+      <w:r>
+        <w:rPr>
+          <w:rFonts w:ascii="Arial" w:cs="Arial" w:eastAsia="Arial" w:hAnsi="Arial"/>
+          <w:sz w:val="22"/>
+          <w:szCs w:val="22"/>
+        </w:rPr>
+        <w:t xml:space="preserve"/>
       </w:r>
     </w:p>
     <w:p>
@@ -167,10 +389,20 @@
       <w:r>
         <w:rPr>
           <w:rFonts w:ascii="Arial" w:cs="Arial" w:eastAsia="Arial" w:hAnsi="Arial"/>
-          <w:sz w:val="22"/>
-          <w:szCs w:val="22"/>
-        </w:rPr>
-        <w:t xml:space="preserve">Under our current AMA-based pipeline, the microsoft_windows_raw dataset is fully populated - XDM fields like process_name, process_cmd, user, process_path, event_action, and event_result are all coming through correctly.</w:t>
+          <w:b/>
+          <w:bCs/>
+          <w:sz w:val="22"/>
+          <w:szCs w:val="22"/>
+        </w:rPr>
+        <w:t xml:space="preserve">What format should Cribl Stream use when sending Windows events to XSIAM via the custom HTTP endpoint</w:t>
+      </w:r>
+      <w:r>
+        <w:rPr>
+          <w:rFonts w:ascii="Arial" w:cs="Arial" w:eastAsia="Arial" w:hAnsi="Arial"/>
+          <w:sz w:val="22"/>
+          <w:szCs w:val="22"/>
+        </w:rPr>
+        <w:t xml:space="preserve"> so that the existing parsing and XDM normalisation continues to work exactly as it does today? Specifically - does XSIAM expect raw Windows event XML, JSON, or a specific envelope structure for the microsoft_windows_raw dataset?</w:t>
       </w:r>
     </w:p>
     <w:p>
@@ -185,10 +417,20 @@
       <w:r>
         <w:rPr>
           <w:rFonts w:ascii="Arial" w:cs="Arial" w:eastAsia="Arial" w:hAnsi="Arial"/>
-          <w:sz w:val="22"/>
-          <w:szCs w:val="22"/>
-        </w:rPr>
-        <w:t xml:space="preserve">After switching to Cribl Stream via the custom HTTP endpoint, the raw event data is arriving correctly. The event_data field contains all expected sub-fields (SubjectUserName, CommandLine, NewProcessName, etc.).</w:t>
+          <w:b/>
+          <w:bCs/>
+          <w:sz w:val="22"/>
+          <w:szCs w:val="22"/>
+        </w:rPr>
+        <w:t xml:space="preserve">Are there any additional configuration steps required on the XSIAM side</w:t>
+      </w:r>
+      <w:r>
+        <w:rPr>
+          <w:rFonts w:ascii="Arial" w:cs="Arial" w:eastAsia="Arial" w:hAnsi="Arial"/>
+          <w:sz w:val="22"/>
+          <w:szCs w:val="22"/>
+        </w:rPr>
+        <w:t xml:space="preserve"> when the data source changes from a direct WEC broker to a third-party forwarder like Cribl Stream? For example, parser rules, collector type settings, or dataset-level configuration.</w:t>
       </w:r>
     </w:p>
     <w:p>
@@ -203,28 +445,20 @@
       <w:r>
         <w:rPr>
           <w:rFonts w:ascii="Arial" w:cs="Arial" w:eastAsia="Arial" w:hAnsi="Arial"/>
-          <w:sz w:val="22"/>
-          <w:szCs w:val="22"/>
-        </w:rPr>
-        <w:t xml:space="preserve">However, the XDM-normalised fields are coming through </w:t>
-      </w:r>
-      <w:r>
-        <w:rPr>
-          <w:rFonts w:ascii="Arial" w:cs="Arial" w:eastAsia="Arial" w:hAnsi="Arial"/>
           <w:b/>
           <w:bCs/>
           <w:sz w:val="22"/>
           <w:szCs w:val="22"/>
         </w:rPr>
-        <w:t xml:space="preserve">empty</w:t>
-      </w:r>
-      <w:r>
-        <w:rPr>
-          <w:rFonts w:ascii="Arial" w:cs="Arial" w:eastAsia="Arial" w:hAnsi="Arial"/>
-          <w:sz w:val="22"/>
-          <w:szCs w:val="22"/>
-        </w:rPr>
-        <w:t xml:space="preserve">. The data is there but XSIAM is not mapping it into the right XDM fields the way it did under AMA.</w:t>
+        <w:t xml:space="preserve">Is there documentation or a recommended integration pattern</w:t>
+      </w:r>
+      <w:r>
+        <w:rPr>
+          <w:rFonts w:ascii="Arial" w:cs="Arial" w:eastAsia="Arial" w:hAnsi="Arial"/>
+          <w:sz w:val="22"/>
+          <w:szCs w:val="22"/>
+        </w:rPr>
+        <w:t xml:space="preserve"> for forwarding Windows events from Cribl Stream to XSIAM via custom HTTP endpoint while preserving the existing XDM field mapping and normalisation?</w:t>
       </w:r>
     </w:p>
     <w:p>
@@ -256,246 +490,46 @@
           <w:sz w:val="24"/>
           <w:szCs w:val="24"/>
         </w:rPr>
-        <w:t xml:space="preserve">Our Questions</w:t>
-      </w:r>
-    </w:p>
-    <w:p>
-      <w:pPr>
-        <w:pStyle w:val="ListParagraph"/>
-        <w:numPr>
-          <w:ilvl w:val="0"/>
-          <w:numId w:val="2"/>
-        </w:numPr>
-        <w:spacing w:after="100"/>
-      </w:pPr>
-      <w:r>
-        <w:rPr>
-          <w:rFonts w:ascii="Arial" w:cs="Arial" w:eastAsia="Arial" w:hAnsi="Arial"/>
-          <w:b/>
-          <w:bCs/>
-          <w:sz w:val="22"/>
-          <w:szCs w:val="22"/>
-        </w:rPr>
-        <w:t xml:space="preserve">Ingestion format:</w:t>
-      </w:r>
-      <w:r>
-        <w:rPr>
-          <w:rFonts w:ascii="Arial" w:cs="Arial" w:eastAsia="Arial" w:hAnsi="Arial"/>
-          <w:sz w:val="22"/>
-          <w:szCs w:val="22"/>
-        </w:rPr>
-        <w:t xml:space="preserve"> What format does XSIAM's parser expect for the microsoft_windows_raw dataset via the custom HTTP endpoint? AMA likely sent raw Windows event XML. Cribl can send either XML or JSON. Does the format matter for XDM parsing to fire?</w:t>
-      </w:r>
-    </w:p>
-    <w:p>
-      <w:pPr>
-        <w:pStyle w:val="ListParagraph"/>
-        <w:numPr>
-          <w:ilvl w:val="0"/>
-          <w:numId w:val="2"/>
-        </w:numPr>
-        <w:spacing w:after="100"/>
-      </w:pPr>
-      <w:r>
-        <w:rPr>
-          <w:rFonts w:ascii="Arial" w:cs="Arial" w:eastAsia="Arial" w:hAnsi="Arial"/>
-          <w:b/>
-          <w:bCs/>
-          <w:sz w:val="22"/>
-          <w:szCs w:val="22"/>
-        </w:rPr>
-        <w:t xml:space="preserve">_raw_log dependency:</w:t>
-      </w:r>
-      <w:r>
-        <w:rPr>
-          <w:rFonts w:ascii="Arial" w:cs="Arial" w:eastAsia="Arial" w:hAnsi="Arial"/>
-          <w:sz w:val="22"/>
-          <w:szCs w:val="22"/>
-        </w:rPr>
-        <w:t xml:space="preserve"> Is the full raw event XML in _raw_log required for XDM normalisation to work, or can XSIAM parse from the event_data JSON object alone?</w:t>
-      </w:r>
-    </w:p>
-    <w:p>
-      <w:pPr>
-        <w:pStyle w:val="ListParagraph"/>
-        <w:numPr>
-          <w:ilvl w:val="0"/>
-          <w:numId w:val="2"/>
-        </w:numPr>
-        <w:spacing w:after="100"/>
-      </w:pPr>
-      <w:r>
-        <w:rPr>
-          <w:rFonts w:ascii="Arial" w:cs="Arial" w:eastAsia="Arial" w:hAnsi="Arial"/>
-          <w:b/>
-          <w:bCs/>
-          <w:sz w:val="22"/>
-          <w:szCs w:val="22"/>
-        </w:rPr>
-        <w:t xml:space="preserve">Parser trigger:</w:t>
-      </w:r>
-      <w:r>
-        <w:rPr>
-          <w:rFonts w:ascii="Arial" w:cs="Arial" w:eastAsia="Arial" w:hAnsi="Arial"/>
-          <w:sz w:val="22"/>
-          <w:szCs w:val="22"/>
-        </w:rPr>
-        <w:t xml:space="preserve"> What determines which parsing pipeline XSIAM applies to incoming events? Is it _collector_type (currently showing as WEC), the dataset name, or something else? If Cribl identifies itself differently from AMA, could that cause XDM rules to not apply?</w:t>
-      </w:r>
-    </w:p>
-    <w:p>
-      <w:pPr>
-        <w:pStyle w:val="ListParagraph"/>
-        <w:numPr>
-          <w:ilvl w:val="0"/>
-          <w:numId w:val="2"/>
-        </w:numPr>
-        <w:spacing w:after="100"/>
-      </w:pPr>
-      <w:r>
-        <w:rPr>
-          <w:rFonts w:ascii="Arial" w:cs="Arial" w:eastAsia="Arial" w:hAnsi="Arial"/>
-          <w:b/>
-          <w:bCs/>
-          <w:sz w:val="22"/>
-          <w:szCs w:val="22"/>
-        </w:rPr>
-        <w:t xml:space="preserve">Empty XDM fields:</w:t>
-      </w:r>
-      <w:r>
-        <w:rPr>
-          <w:rFonts w:ascii="Arial" w:cs="Arial" w:eastAsia="Arial" w:hAnsi="Arial"/>
-          <w:sz w:val="22"/>
-          <w:szCs w:val="22"/>
-        </w:rPr>
-        <w:t xml:space="preserve"> Given that event_data is correctly populated, why would process_name, process_cmd, user etc. be empty? Is there a configuration step needed on the XSIAM side to point the XDM parser at the new source?</w:t>
-      </w:r>
-    </w:p>
-    <w:p>
-      <w:pPr>
-        <w:pStyle w:val="ListParagraph"/>
-        <w:numPr>
-          <w:ilvl w:val="0"/>
-          <w:numId w:val="2"/>
-        </w:numPr>
-        <w:spacing w:after="100"/>
-      </w:pPr>
-      <w:r>
-        <w:rPr>
-          <w:rFonts w:ascii="Arial" w:cs="Arial" w:eastAsia="Arial" w:hAnsi="Arial"/>
-          <w:b/>
-          <w:bCs/>
-          <w:sz w:val="22"/>
-          <w:szCs w:val="22"/>
-        </w:rPr>
-        <w:t xml:space="preserve">Third-party forwarder guidance:</w:t>
-      </w:r>
-      <w:r>
-        <w:rPr>
-          <w:rFonts w:ascii="Arial" w:cs="Arial" w:eastAsia="Arial" w:hAnsi="Arial"/>
-          <w:sz w:val="22"/>
-          <w:szCs w:val="22"/>
-        </w:rPr>
-        <w:t xml:space="preserve"> Is there a recommended approach for sending Windows events from Cribl Stream to XSIAM via custom HTTP endpoint while preserving full XDM field population?</w:t>
-      </w:r>
-    </w:p>
-    <w:p>
-      <w:pPr>
-        <w:pStyle w:val="ListParagraph"/>
-        <w:numPr>
-          <w:ilvl w:val="0"/>
-          <w:numId w:val="2"/>
-        </w:numPr>
-        <w:spacing w:after="100"/>
-      </w:pPr>
-      <w:r>
-        <w:rPr>
-          <w:rFonts w:ascii="Arial" w:cs="Arial" w:eastAsia="Arial" w:hAnsi="Arial"/>
-          <w:b/>
-          <w:bCs/>
-          <w:sz w:val="22"/>
-          <w:szCs w:val="22"/>
-        </w:rPr>
-        <w:t xml:space="preserve">_raw_json field:</w:t>
-      </w:r>
-      <w:r>
-        <w:rPr>
-          <w:rFonts w:ascii="Arial" w:cs="Arial" w:eastAsia="Arial" w:hAnsi="Arial"/>
-          <w:sz w:val="22"/>
-          <w:szCs w:val="22"/>
-        </w:rPr>
-        <w:t xml:space="preserve"> This field is empty in our current samples. Should Cribl be populating this and if so, what format is expected?</w:t>
-      </w:r>
-    </w:p>
-    <w:p>
-      <w:pPr>
-        <w:spacing w:after="80"/>
-      </w:pPr>
-      <w:r>
-        <w:rPr>
-          <w:rFonts w:ascii="Arial" w:cs="Arial" w:eastAsia="Arial" w:hAnsi="Arial"/>
-          <w:sz w:val="22"/>
-          <w:szCs w:val="22"/>
-        </w:rPr>
-        <w:t xml:space="preserve"/>
-      </w:r>
-    </w:p>
-    <w:p>
-      <w:pPr>
-        <w:pBdr>
-          <w:bottom w:val="single" w:color="1F4E79" w:sz="4"/>
-        </w:pBdr>
-        <w:spacing w:after="120" w:before="240"/>
-      </w:pPr>
-      <w:r>
-        <w:rPr>
-          <w:rFonts w:ascii="Arial" w:cs="Arial" w:eastAsia="Arial" w:hAnsi="Arial"/>
-          <w:b/>
-          <w:bCs/>
-          <w:color w:val="1F4E79"/>
-          <w:sz w:val="24"/>
-          <w:szCs w:val="24"/>
-        </w:rPr>
-        <w:t xml:space="preserve">Our Goal</w:t>
-      </w:r>
-    </w:p>
-    <w:p>
-      <w:pPr>
-        <w:spacing w:after="100"/>
-      </w:pPr>
-      <w:r>
-        <w:rPr>
-          <w:rFonts w:ascii="Arial" w:cs="Arial" w:eastAsia="Arial" w:hAnsi="Arial"/>
-          <w:sz w:val="22"/>
-          <w:szCs w:val="22"/>
-        </w:rPr>
-        <w:t xml:space="preserve">We want the transition from AMA to Cribl to be transparent from XSIAM's perspective - same dataset, same field population, same XDM coverage. We are not looking to change anything on the XSIAM side. We just need to know what Cribl needs to send to make the existing parsing continue to work as-is.</w:t>
-      </w:r>
-    </w:p>
-    <w:p>
-      <w:pPr>
-        <w:spacing w:after="80"/>
-      </w:pPr>
-      <w:r>
-        <w:rPr>
-          <w:rFonts w:ascii="Arial" w:cs="Arial" w:eastAsia="Arial" w:hAnsi="Arial"/>
-          <w:sz w:val="22"/>
-          <w:szCs w:val="22"/>
-        </w:rPr>
-        <w:t xml:space="preserve"/>
-      </w:r>
-    </w:p>
-    <w:p>
-      <w:pPr>
-        <w:spacing w:after="100"/>
-      </w:pPr>
-      <w:r>
-        <w:rPr>
-          <w:rFonts w:ascii="Arial" w:cs="Arial" w:eastAsia="Arial" w:hAnsi="Arial"/>
-          <w:sz w:val="22"/>
-          <w:szCs w:val="22"/>
-        </w:rPr>
-        <w:t xml:space="preserve">Would it be possible to schedule a call to walk through this? We are happy to share sample event payloads from both the old AMA path and the current Cribl path to help diagnose the difference.</w:t>
+        <w:t xml:space="preserve">Why This Matters</w:t>
+      </w:r>
+    </w:p>
+    <w:p>
+      <w:pPr>
+        <w:spacing w:after="100"/>
+      </w:pPr>
+      <w:r>
+        <w:rPr>
+          <w:rFonts w:ascii="Arial" w:cs="Arial" w:eastAsia="Arial" w:hAnsi="Arial"/>
+          <w:sz w:val="22"/>
+          <w:szCs w:val="22"/>
+        </w:rPr>
+        <w:t xml:space="preserve">We want to validate the Cribl integration end to end before we decommission the existing WEC broker path. If there are any format or configuration requirements on the XSIAM side, we would like to address them upfront so the cutover is seamless.</w:t>
+      </w:r>
+    </w:p>
+    <w:p>
+      <w:pPr>
+        <w:spacing w:after="80"/>
+      </w:pPr>
+      <w:r>
+        <w:rPr>
+          <w:rFonts w:ascii="Arial" w:cs="Arial" w:eastAsia="Arial" w:hAnsi="Arial"/>
+          <w:sz w:val="22"/>
+          <w:szCs w:val="22"/>
+        </w:rPr>
+        <w:t xml:space="preserve"/>
+      </w:r>
+    </w:p>
+    <w:p>
+      <w:pPr>
+        <w:spacing w:after="100"/>
+      </w:pPr>
+      <w:r>
+        <w:rPr>
+          <w:rFonts w:ascii="Arial" w:cs="Arial" w:eastAsia="Arial" w:hAnsi="Arial"/>
+          <w:sz w:val="22"/>
+          <w:szCs w:val="22"/>
+        </w:rPr>
+        <w:t xml:space="preserve">Would it be possible to schedule a call to walk through this together? We are happy to share our current pipeline architecture and sample data from both the existing and new paths to help with the discussion.</w:t>
       </w:r>
     </w:p>
     <w:p>

</xml_diff>

<commit_message>
Re-push Palo Alto email - fixed corrupt XML
</commit_message>
<xml_diff>
--- a/emails/email_palo_alto.docx
+++ b/emails/email_palo_alto.docx
@@ -184,6 +184,7 @@
     <w:p>
       <w:pPr>
         <w:spacing w:after="100"/>
+        <w:ind w:left="720"/>
       </w:pPr>
       <w:r>
         <w:rPr>
@@ -193,7 +194,6 @@
         </w:rPr>
         <w:t xml:space="preserve">Windows Endpoints  -&gt;  WEC Servers  -&gt;  WEC Brokers  -&gt;  XSIAM</w:t>
       </w:r>
-      <indent/>
     </w:p>
     <w:p>
       <w:pPr>
@@ -282,6 +282,7 @@
     <w:p>
       <w:pPr>
         <w:spacing w:after="100"/>
+        <w:ind w:left="720"/>
       </w:pPr>
       <w:r>
         <w:rPr>
@@ -291,7 +292,6 @@
         </w:rPr>
         <w:t xml:space="preserve">Windows Endpoints  -&gt;  WEC Servers  -&gt;  Cribl Edge  -&gt;  Cribl Stream  -&gt;  XSIAM</w:t>
       </w:r>
-      <indent/>
     </w:p>
     <w:p>
       <w:pPr>

</xml_diff>